<commit_message>
Update application documents for Africa Health-Tech Accelerator 2026
- Revised the `build_africa-health-tech-accelerator_docs.py` script to reflect the current status of the FCHIP project, clarifying that it is still in pre-MVP/pilot preparation.
- Updated `africa-health-tech-accelerator_word.docx`, `africa-health-tech-accelerator_pdf.pdf`, and `africa-health-tech-accelerator_ppt.pptx` to align with the new status and ensure accurate representation of application readiness.
- Enhanced the `source_of_truth.mdc` to emphasize the need for confirmed evidence before submission, particularly regarding MVP status and founder information.
</commit_message>
<xml_diff>
--- a/applications/africa-health-tech-accelerator/documents/africa-health-tech-accelerator_word.docx
+++ b/applications/africa-health-tech-accelerator/documents/africa-health-tech-accelerator_word.docx
@@ -331,7 +331,7 @@
                 <w:color w:val="1E2F38"/>
                 <w:sz w:val="17"/>
               </w:rPr>
-              <w:t>Recommended stage</w:t>
+              <w:t>Repo product stage</w:t>
             </w:r>
           </w:p>
         </w:tc>
@@ -357,7 +357,7 @@
                 <w:color w:val="1E2F38"/>
                 <w:sz w:val="17"/>
               </w:rPr>
-              <w:t>MVP - only if demonstrable</w:t>
+              <w:t>Pre-MVP / pilot preparation unless a demo exists</w:t>
             </w:r>
           </w:p>
         </w:tc>
@@ -409,7 +409,7 @@
                 <w:color w:val="1E2F38"/>
                 <w:sz w:val="17"/>
               </w:rPr>
-              <w:t>Application draft - identity and commercial fields require confirmation</w:t>
+              <w:t>Application draft - FCHIP still appears pre-MVP in repo evidence; identity, commercial, and MVP fields require confirmation</w:t>
             </w:r>
           </w:p>
         </w:tc>
@@ -462,7 +462,7 @@
           <w:color w:val="A3312D"/>
           <w:sz w:val="20"/>
         </w:rPr>
-        <w:t>The portal requires at least two founders and a minimum viable product. The repository confirms strong field operations, but it does not verify the founder, commercial, or FCHIP MVP facts below. Complete these items before submission.</w:t>
+        <w:t>The portal requires at least two founders and a minimum viable product. The repository confirms strong FairBanks field operations, but current materials describe FCHIP as still being built for pilot. Do not claim MVP stage, paying FCHIP customers, or AI performance without evidence.</w:t>
       </w:r>
     </w:p>
     <w:p>
@@ -494,7 +494,7 @@
           <w:color w:val="1E2F38"/>
           <w:sz w:val="20"/>
         </w:rPr>
-        <w:t>Confirm that a working FCHIP MVP exists and provide a demo or evidence.</w:t>
+        <w:t>Confirm a working FCHIP MVP with a demo or evidence. Repo materials currently describe FCHIP as still being built/piloted, so do not select MVP unless that is no longer true.</w:t>
       </w:r>
     </w:p>
     <w:p>
@@ -768,7 +768,7 @@
                 <w:color w:val="A3312D"/>
                 <w:sz w:val="18"/>
               </w:rPr>
-              <w:t>CONFIRM BEFORE SUBMISSION</w:t>
+              <w:t>CONFIRM BEFORE SUBMISSION - currently pre-MVP in repo</w:t>
             </w:r>
           </w:p>
         </w:tc>
@@ -2248,7 +2248,7 @@
                 <w:color w:val="A3312D"/>
                 <w:sz w:val="17"/>
               </w:rPr>
-              <w:t>[CONFIRM BEFORE SUBMISSION: select MVP only if a working product can be demonstrated; the programme requires an MVP]</w:t>
+              <w:t>[CONFIRM BEFORE SUBMISSION. Repo evidence points to pre-MVP / pilot preparation. Select MVP only if a working product can be demonstrated - the programme requires an MVP.]</w:t>
             </w:r>
           </w:p>
         </w:tc>
@@ -5327,6 +5327,22 @@
           <w:color w:val="1E2F38"/>
           <w:sz w:val="20"/>
         </w:rPr>
+        <w:t>Internal application materials cite 40+ CHWs and VHTs collecting field data weekly (confirm the current number before using it in the portal).</w:t>
+      </w:r>
+    </w:p>
+    <w:p>
+      <w:pPr>
+        <w:pStyle w:val="ListBullet"/>
+        <w:spacing w:after="40"/>
+      </w:pPr>
+      <w:r>
+        <w:rPr>
+          <w:rFonts w:ascii="Aptos" w:hAnsi="Aptos"/>
+          <w:b w:val="0"/>
+          <w:i w:val="0"/>
+          <w:color w:val="1E2F38"/>
+          <w:sz w:val="20"/>
+        </w:rPr>
         <w:t>Existing maternal and child health, Gericare, NCD screening, school, and corporate health work.</w:t>
       </w:r>
     </w:p>
@@ -5344,6 +5360,22 @@
           <w:sz w:val="20"/>
         </w:rPr>
         <w:t>Digital health records and pharmacy workflows that can inform product integration.</w:t>
+      </w:r>
+    </w:p>
+    <w:p>
+      <w:pPr>
+        <w:pStyle w:val="ListBullet"/>
+        <w:spacing w:after="40"/>
+      </w:pPr>
+      <w:r>
+        <w:rPr>
+          <w:rFonts w:ascii="Aptos" w:hAnsi="Aptos"/>
+          <w:b w:val="0"/>
+          <w:i w:val="0"/>
+          <w:color w:val="1E2F38"/>
+          <w:sz w:val="20"/>
+        </w:rPr>
+        <w:t>FCHIP itself remains a planned / pre-MVP build in current repository materials unless newer product evidence is supplied.</w:t>
       </w:r>
     </w:p>
     <w:p>

</xml_diff>

<commit_message>
Enhance FCHIP documentation with secure EMR/HMS data integration details
- Updated `build_africa-health-tech-accelerator_docs.py` and related documents to include comprehensive information on FCHIP's capability to securely expose authenticated data APIs for real-time clinical data sharing with existing EMR and HMS systems.
- Revised problem and solution statements to clarify how FCHIP transforms primary healthcare from reactive to proactive by integrating clinical data seamlessly.
- Improved overall narrative consistency across project documentation, reinforcing FairBanks' commitment to community health intelligence and timely healthcare delivery.
</commit_message>
<xml_diff>
--- a/applications/africa-health-tech-accelerator/documents/africa-health-tech-accelerator_word.docx
+++ b/applications/africa-health-tech-accelerator/documents/africa-health-tech-accelerator_word.docx
@@ -1392,7 +1392,7 @@
           <w:color w:val="1E2F38"/>
           <w:sz w:val="20"/>
         </w:rPr>
-        <w:t>Preventive health, remote monitoring, EHR integration, and supply planning.</w:t>
+        <w:t>Preventive health, remote monitoring, secure EMR/HMS APIs, and supply planning.</w:t>
       </w:r>
     </w:p>
     <w:p>
@@ -2488,7 +2488,7 @@
                 <w:color w:val="1E2F38"/>
                 <w:sz w:val="17"/>
               </w:rPr>
-              <w:t>Primary healthcare in underserved African communities is still reactive. Facilities often see people only after illness has worsened, while useful signals from CHW and VHT visits, outreach screenings, maternal care, pharmacy activity, and facility records remain fragmented. This delays outbreak detection, high-risk pregnancy referral, NCD follow-up, and medicine planning. Clinics and district teams therefore lack a timely, community-level view of who is at risk, where health threats are growing, and what action should happen next.</w:t>
+              <w:t>Primary healthcare in underserved African communities is still reactive. Facilities often see people only after illness has worsened, while useful signals from CHW and VHT visits, outreach screenings, maternal care, pharmacy activity, and facility records remain fragmented. Clinical data often stays locked inside existing EMR or hospital management systems, so community and facility intelligence cannot fuse in real time. This delays outbreak detection, high-risk pregnancy referral, NCD follow-up, and medicine planning. Clinics and district teams therefore lack a timely, community-level view of who is at risk, where health threats are growing, and what action should happen next.</w:t>
             </w:r>
           </w:p>
         </w:tc>
@@ -2540,7 +2540,7 @@
                 <w:color w:val="1E2F38"/>
                 <w:sz w:val="17"/>
               </w:rPr>
-              <w:t>FCHIP is an offline-capable community health intelligence platform. CHWs and VHTs capture structured household and outreach data through mobile tools; approved facility and programme data are synchronized securely; and an analytics layer produces risk flags, GIS hotspot maps, referrals, and dashboards. The first release focuses on three practical use cases: maternal risk and missed-care alerts, hypertension and diabetes hotspot detection, and community disease surveillance. FairBanks will validate the product in its existing medical centre and Community Reach network before expanding to partner clinics and districts.</w:t>
+              <w:t>FCHIP is an offline-capable community health intelligence platform. CHWs and VHTs capture structured household and outreach data through mobile tools; approved facility and programme data are synchronized securely; and FCHIP safely exposes authenticated data APIs to existing EMR and HMS systems so clinics can share clinical records into the platform in real time without replacing the software they already use. An analytics layer produces risk flags, GIS hotspot maps, referrals, and dashboards. The first release focuses on three practical use cases: maternal risk and missed-care alerts, hypertension and diabetes hotspot detection, and community disease surveillance. FairBanks will validate the product in its existing medical centre and Community Reach network before expanding to partner clinics and districts.</w:t>
             </w:r>
           </w:p>
         </w:tc>
@@ -2752,7 +2752,7 @@
                 <w:color w:val="1E2F38"/>
                 <w:sz w:val="17"/>
               </w:rPr>
-              <w:t>FairBanks combines what many health-tech startups and facilities lack: a live medical centre, active outreach programmes, CHW and VHT links, digital health workflows, and a product designed from real community care. This gives FCHIP a direct test environment and a trusted route to users. The platform is not only an electronic register; it closes the loop from community signal to risk insight, referral, targeted outreach, and follow-up.</w:t>
+              <w:t>FairBanks combines what many health-tech startups and facilities lack: a live medical centre, active outreach programmes, CHW and VHT links, digital health workflows, and a product designed from real community care. This gives FCHIP a direct test environment and a trusted route to users. Secure EMR/HMS data APIs let facilities plug clinical feeds into FCHIP without ripping out existing systems. The platform is not only an electronic register; it closes the loop from community and facility signal to risk insight, referral, targeted outreach, and follow-up.</w:t>
             </w:r>
           </w:p>
         </w:tc>
@@ -4246,7 +4246,7 @@
           <w:color w:val="1E2F38"/>
           <w:sz w:val="20"/>
         </w:rPr>
-        <w:t>Primary healthcare in underserved African communities is still reactive. Facilities often see people only after illness has worsened, while useful signals from CHW and VHT visits, outreach screenings, maternal care, pharmacy activity, and facility records remain fragmented. This delays outbreak detection, high-risk pregnancy referral, NCD follow-up, and medicine planning. Clinics and district teams therefore lack a timely, community-level view of who is at risk, where health threats are growing, and what action should happen next.</w:t>
+        <w:t>Primary healthcare in underserved African communities is still reactive. Facilities often see people only after illness has worsened, while useful signals from CHW and VHT visits, outreach screenings, maternal care, pharmacy activity, and facility records remain fragmented. Clinical data often stays locked inside existing EMR or hospital management systems, so community and facility intelligence cannot fuse in real time. This delays outbreak detection, high-risk pregnancy referral, NCD follow-up, and medicine planning. Clinics and district teams therefore lack a timely, community-level view of who is at risk, where health threats are growing, and what action should happen next.</w:t>
       </w:r>
     </w:p>
     <w:p>
@@ -4270,7 +4270,7 @@
           <w:color w:val="1E2F38"/>
           <w:sz w:val="20"/>
         </w:rPr>
-        <w:t>FCHIP is an offline-capable community health intelligence platform. CHWs and VHTs capture structured household and outreach data through mobile tools; approved facility and programme data are synchronized securely; and an analytics layer produces risk flags, GIS hotspot maps, referrals, and dashboards. The first release focuses on three practical use cases: maternal risk and missed-care alerts, hypertension and diabetes hotspot detection, and community disease surveillance. FairBanks will validate the product in its existing medical centre and Community Reach network before expanding to partner clinics and districts.</w:t>
+        <w:t>FCHIP is an offline-capable community health intelligence platform. CHWs and VHTs capture structured household and outreach data through mobile tools; approved facility and programme data are synchronized securely; and FCHIP safely exposes authenticated data APIs to existing EMR and HMS systems so clinics can share clinical records into the platform in real time without replacing the software they already use. An analytics layer produces risk flags, GIS hotspot maps, referrals, and dashboards. The first release focuses on three practical use cases: maternal risk and missed-care alerts, hypertension and diabetes hotspot detection, and community disease surveillance. FairBanks will validate the product in its existing medical centre and Community Reach network before expanding to partner clinics and districts.</w:t>
       </w:r>
     </w:p>
     <w:p>
@@ -4294,7 +4294,7 @@
           <w:color w:val="1E2F38"/>
           <w:sz w:val="20"/>
         </w:rPr>
-        <w:t>FairBanks combines what many health-tech startups and facilities lack: a live medical centre, active outreach programmes, CHW and VHT links, digital health workflows, and a product designed from real community care. This gives FCHIP a direct test environment and a trusted route to users. The platform is not only an electronic register; it closes the loop from community signal to risk insight, referral, targeted outreach, and follow-up.</w:t>
+        <w:t>FairBanks combines what many health-tech startups and facilities lack: a live medical centre, active outreach programmes, CHW and VHT links, digital health workflows, and a product designed from real community care. This gives FCHIP a direct test environment and a trusted route to users. Secure EMR/HMS data APIs let facilities plug clinical feeds into FCHIP without ripping out existing systems. The platform is not only an electronic register; it closes the loop from community and facility signal to risk insight, referral, targeted outreach, and follow-up.</w:t>
       </w:r>
     </w:p>
     <w:p>
@@ -4501,6 +4501,59 @@
                 <w:color w:val="1E2F38"/>
                 <w:sz w:val="18"/>
               </w:rPr>
+              <w:t>Secure EMR/HMS data APIs</w:t>
+            </w:r>
+          </w:p>
+        </w:tc>
+        <w:tc>
+          <w:tcPr>
+            <w:tcW w:type="dxa" w:w="6624"/>
+            <w:tcMar>
+              <w:top w:w="100" w:type="dxa"/>
+              <w:start w:w="120" w:type="dxa"/>
+              <w:bottom w:w="100" w:type="dxa"/>
+              <w:end w:w="120" w:type="dxa"/>
+            </w:tcMar>
+            <w:vAlign w:val="top"/>
+          </w:tcPr>
+          <w:p>
+            <w:r/>
+            <w:r>
+              <w:rPr>
+                <w:rFonts w:ascii="Aptos" w:hAnsi="Aptos"/>
+                <w:b w:val="0"/>
+                <w:i w:val="0"/>
+                <w:color w:val="1E2F38"/>
+                <w:sz w:val="18"/>
+              </w:rPr>
+              <w:t>Authenticated, consent-aware APIs so existing EMR/HMS systems can share clinical data in real time</w:t>
+            </w:r>
+          </w:p>
+        </w:tc>
+      </w:tr>
+      <w:tr>
+        <w:tc>
+          <w:tcPr>
+            <w:tcW w:type="dxa" w:w="2880"/>
+            <w:tcMar>
+              <w:top w:w="100" w:type="dxa"/>
+              <w:start w:w="120" w:type="dxa"/>
+              <w:bottom w:w="100" w:type="dxa"/>
+              <w:end w:w="120" w:type="dxa"/>
+            </w:tcMar>
+            <w:shd w:fill="E8F3F2"/>
+            <w:vAlign w:val="top"/>
+          </w:tcPr>
+          <w:p>
+            <w:r/>
+            <w:r>
+              <w:rPr>
+                <w:rFonts w:ascii="Aptos" w:hAnsi="Aptos"/>
+                <w:b/>
+                <w:i w:val="0"/>
+                <w:color w:val="1E2F38"/>
+                <w:sz w:val="18"/>
+              </w:rPr>
               <w:t>Secure data pipeline</w:t>
             </w:r>
           </w:p>
@@ -4514,6 +4567,7 @@
               <w:bottom w:w="100" w:type="dxa"/>
               <w:end w:w="120" w:type="dxa"/>
             </w:tcMar>
+            <w:shd w:fill="E8F3F2"/>
             <w:vAlign w:val="top"/>
           </w:tcPr>
           <w:p>
@@ -4541,7 +4595,6 @@
               <w:bottom w:w="100" w:type="dxa"/>
               <w:end w:w="120" w:type="dxa"/>
             </w:tcMar>
-            <w:shd w:fill="E8F3F2"/>
             <w:vAlign w:val="top"/>
           </w:tcPr>
           <w:p>
@@ -4567,7 +4620,6 @@
               <w:bottom w:w="100" w:type="dxa"/>
               <w:end w:w="120" w:type="dxa"/>
             </w:tcMar>
-            <w:shd w:fill="E8F3F2"/>
             <w:vAlign w:val="top"/>
           </w:tcPr>
           <w:p>
@@ -4595,6 +4647,7 @@
               <w:bottom w:w="100" w:type="dxa"/>
               <w:end w:w="120" w:type="dxa"/>
             </w:tcMar>
+            <w:shd w:fill="E8F3F2"/>
             <w:vAlign w:val="top"/>
           </w:tcPr>
           <w:p>
@@ -4620,6 +4673,7 @@
               <w:bottom w:w="100" w:type="dxa"/>
               <w:end w:w="120" w:type="dxa"/>
             </w:tcMar>
+            <w:shd w:fill="E8F3F2"/>
             <w:vAlign w:val="top"/>
           </w:tcPr>
           <w:p>
@@ -4647,7 +4701,6 @@
               <w:bottom w:w="100" w:type="dxa"/>
               <w:end w:w="120" w:type="dxa"/>
             </w:tcMar>
-            <w:shd w:fill="E8F3F2"/>
             <w:vAlign w:val="top"/>
           </w:tcPr>
           <w:p>
@@ -4673,7 +4726,6 @@
               <w:bottom w:w="100" w:type="dxa"/>
               <w:end w:w="120" w:type="dxa"/>
             </w:tcMar>
-            <w:shd w:fill="E8F3F2"/>
             <w:vAlign w:val="top"/>
           </w:tcPr>
           <w:p>
@@ -5062,7 +5114,7 @@
                 <w:color w:val="1E2F38"/>
                 <w:sz w:val="18"/>
               </w:rPr>
-              <w:t>API and integration services</w:t>
+              <w:t>Secure EMR/HMS data APIs and other integration services</w:t>
             </w:r>
           </w:p>
         </w:tc>
@@ -5360,6 +5412,22 @@
           <w:sz w:val="20"/>
         </w:rPr>
         <w:t>Digital health records and pharmacy workflows that can inform product integration.</w:t>
+      </w:r>
+    </w:p>
+    <w:p>
+      <w:pPr>
+        <w:pStyle w:val="ListBullet"/>
+        <w:spacing w:after="40"/>
+      </w:pPr>
+      <w:r>
+        <w:rPr>
+          <w:rFonts w:ascii="Aptos" w:hAnsi="Aptos"/>
+          <w:b w:val="0"/>
+          <w:i w:val="0"/>
+          <w:color w:val="1E2F38"/>
+          <w:sz w:val="20"/>
+        </w:rPr>
+        <w:t>Planned secure EMR/HMS data APIs so existing facility systems can feed clinical data into FCHIP in real time without replacement.</w:t>
       </w:r>
     </w:p>
     <w:p>
@@ -6018,7 +6086,7 @@
                 <w:color w:val="1E2F38"/>
                 <w:sz w:val="18"/>
               </w:rPr>
-              <w:t>Improve offline UX, workflow fit, dashboards, and interoperability.</w:t>
+              <w:t>Improve offline UX, workflow fit, dashboards, and secure EMR/HMS APIs.</w:t>
             </w:r>
           </w:p>
         </w:tc>
@@ -6327,7 +6395,7 @@
                 <w:color w:val="1E2F38"/>
                 <w:sz w:val="17"/>
               </w:rPr>
-              <w:t>Consent, minimisation, role-based access, audit logs, and Uganda compliance.</w:t>
+              <w:t>Consent, minimisation, role-based access, audit logs, and Uganda compliance; EMR/HMS APIs use authentication and least-privilege scopes.</w:t>
             </w:r>
           </w:p>
         </w:tc>
@@ -6354,6 +6422,59 @@
                 <w:color w:val="1E2F38"/>
                 <w:sz w:val="17"/>
               </w:rPr>
+              <w:t>EMR/HMS friction</w:t>
+            </w:r>
+          </w:p>
+        </w:tc>
+        <w:tc>
+          <w:tcPr>
+            <w:tcW w:type="dxa" w:w="6912"/>
+            <w:tcMar>
+              <w:top w:w="70" w:type="dxa"/>
+              <w:start w:w="120" w:type="dxa"/>
+              <w:bottom w:w="70" w:type="dxa"/>
+              <w:end w:w="120" w:type="dxa"/>
+            </w:tcMar>
+            <w:vAlign w:val="top"/>
+          </w:tcPr>
+          <w:p>
+            <w:r/>
+            <w:r>
+              <w:rPr>
+                <w:rFonts w:ascii="Aptos" w:hAnsi="Aptos"/>
+                <w:b w:val="0"/>
+                <w:i w:val="0"/>
+                <w:color w:val="1E2F38"/>
+                <w:sz w:val="17"/>
+              </w:rPr>
+              <w:t>Expose stable documented APIs; start with FairBanks systems; do not require replacing existing EMR/HMS.</w:t>
+            </w:r>
+          </w:p>
+        </w:tc>
+      </w:tr>
+      <w:tr>
+        <w:tc>
+          <w:tcPr>
+            <w:tcW w:type="dxa" w:w="2592"/>
+            <w:tcMar>
+              <w:top w:w="70" w:type="dxa"/>
+              <w:start w:w="120" w:type="dxa"/>
+              <w:bottom w:w="70" w:type="dxa"/>
+              <w:end w:w="120" w:type="dxa"/>
+            </w:tcMar>
+            <w:shd w:fill="E8F3F2"/>
+            <w:vAlign w:val="top"/>
+          </w:tcPr>
+          <w:p>
+            <w:r/>
+            <w:r>
+              <w:rPr>
+                <w:rFonts w:ascii="Aptos" w:hAnsi="Aptos"/>
+                <w:b/>
+                <w:i w:val="0"/>
+                <w:color w:val="1E2F38"/>
+                <w:sz w:val="17"/>
+              </w:rPr>
               <w:t>AI accuracy</w:t>
             </w:r>
           </w:p>
@@ -6367,6 +6488,7 @@
               <w:bottom w:w="70" w:type="dxa"/>
               <w:end w:w="120" w:type="dxa"/>
             </w:tcMar>
+            <w:shd w:fill="E8F3F2"/>
             <w:vAlign w:val="top"/>
           </w:tcPr>
           <w:p>
@@ -6394,7 +6516,6 @@
               <w:bottom w:w="70" w:type="dxa"/>
               <w:end w:w="120" w:type="dxa"/>
             </w:tcMar>
-            <w:shd w:fill="E8F3F2"/>
             <w:vAlign w:val="top"/>
           </w:tcPr>
           <w:p>
@@ -6420,7 +6541,6 @@
               <w:bottom w:w="70" w:type="dxa"/>
               <w:end w:w="120" w:type="dxa"/>
             </w:tcMar>
-            <w:shd w:fill="E8F3F2"/>
             <w:vAlign w:val="top"/>
           </w:tcPr>
           <w:p>
@@ -6448,6 +6568,7 @@
               <w:bottom w:w="70" w:type="dxa"/>
               <w:end w:w="120" w:type="dxa"/>
             </w:tcMar>
+            <w:shd w:fill="E8F3F2"/>
             <w:vAlign w:val="top"/>
           </w:tcPr>
           <w:p>
@@ -6473,6 +6594,7 @@
               <w:bottom w:w="70" w:type="dxa"/>
               <w:end w:w="120" w:type="dxa"/>
             </w:tcMar>
+            <w:shd w:fill="E8F3F2"/>
             <w:vAlign w:val="top"/>
           </w:tcPr>
           <w:p>

</xml_diff>

<commit_message>
Update FCHIP documentation and improve PDF generation process
- Revised target customer descriptions in `build_africa-health-tech-accelerator_docs.py` to include the Ministry of Health, Uganda health federations, and universities, enhancing clarity on FCHIP's audience.
- Implemented a temporary PDF export process in `convert_docx_to_pdf()` to prevent issues with locked files during PDF generation, ensuring smoother document handling.
- Updated related documents to reflect these changes, reinforcing FairBanks' commitment to effective communication and operational efficiency.
</commit_message>
<xml_diff>
--- a/applications/africa-health-tech-accelerator/documents/africa-health-tech-accelerator_word.docx
+++ b/applications/africa-health-tech-accelerator/documents/africa-health-tech-accelerator_word.docx
@@ -2594,7 +2594,7 @@
                 <w:color w:val="1E2F38"/>
                 <w:sz w:val="17"/>
               </w:rPr>
-              <w:t>Private and faith-based clinics, district health offices, NGOs and development programmes, research partners, and health insurers that need better community-level data, follow-up, early warning, and programme monitoring. CHWs and VHTs are the core frontline users.</w:t>
+              <w:t>Private and faith-based clinics, district health offices, the Ministry of Health, Uganda health federations, NGOs and development programmes, universities and other teaching and research institutions, and health insurers that need better community-level data, follow-up, early warning, and programme monitoring. CHWs and VHTs are the core frontline users.</w:t>
             </w:r>
           </w:p>
         </w:tc>
@@ -4785,7 +4785,7 @@
           <w:color w:val="1E2F38"/>
           <w:sz w:val="20"/>
         </w:rPr>
-        <w:t>Private and faith-based clinics, district health offices, NGOs and development programmes, research partners, and health insurers that need better community-level data, follow-up, early warning, and programme monitoring. CHWs and VHTs are the core frontline users.</w:t>
+        <w:t>Private and faith-based clinics, district health offices, the Ministry of Health, Uganda health federations, NGOs and development programmes, universities and other teaching and research institutions, and health insurers that need better community-level data, follow-up, early warning, and programme monitoring. CHWs and VHTs are the core frontline users.</w:t>
       </w:r>
     </w:p>
     <w:tbl>

</xml_diff>

<commit_message>
Refine FCHIP documentation and enhance application pack generation
- Updated `fairBanks_refined_project_idea.mdc` to clarify the funding ask and emphasize the validation and scaling of the working FCHIP MVP.
- Revised `build_africa-health-tech-accelerator_docs.py` to create a dedicated pitch-deck folder, ensuring organized access to the pitch materials for the application process.
- Improved the application pack documents to reflect the confirmed MVP status and updated submission readiness criteria, reinforcing FairBanks' commitment to effective communication and operational readiness.
</commit_message>
<xml_diff>
--- a/applications/africa-health-tech-accelerator/documents/africa-health-tech-accelerator_word.docx
+++ b/applications/africa-health-tech-accelerator/documents/africa-health-tech-accelerator_word.docx
@@ -331,7 +331,7 @@
                 <w:color w:val="1E2F38"/>
                 <w:sz w:val="17"/>
               </w:rPr>
-              <w:t>Repo product stage</w:t>
+              <w:t>Product stage</w:t>
             </w:r>
           </w:p>
         </w:tc>
@@ -357,7 +357,7 @@
                 <w:color w:val="1E2F38"/>
                 <w:sz w:val="17"/>
               </w:rPr>
-              <w:t>Pre-MVP / pilot preparation unless a demo exists</w:t>
+              <w:t>MVP (working product; validating in FairBanks Community Reach)</w:t>
             </w:r>
           </w:p>
         </w:tc>
@@ -409,7 +409,7 @@
                 <w:color w:val="1E2F38"/>
                 <w:sz w:val="17"/>
               </w:rPr>
-              <w:t>Application draft - FCHIP still appears pre-MVP in repo evidence; identity, commercial, and MVP fields require confirmation</w:t>
+              <w:t>Application draft - FCHIP MVP confirmed; founder identity, commercial fields, and public Drive link still require confirmation</w:t>
             </w:r>
           </w:p>
         </w:tc>
@@ -433,7 +433,7 @@
           <w:color w:val="52636C"/>
           <w:sz w:val="16"/>
         </w:rPr>
-        <w:t>Prepared from the live official programme site and all six sections of the application portal on 19 July 2026.</w:t>
+        <w:t>Prepared from the live official programme site and all six sections of the application portal on 20 July 2026.</w:t>
       </w:r>
     </w:p>
     <w:p>
@@ -459,10 +459,10 @@
           <w:rFonts w:ascii="Aptos" w:hAnsi="Aptos"/>
           <w:b/>
           <w:i w:val="0"/>
-          <w:color w:val="A3312D"/>
+          <w:color w:val="C45C26"/>
           <w:sz w:val="20"/>
         </w:rPr>
-        <w:t>The portal requires at least two founders and a minimum viable product. The repository confirms strong FairBanks field operations, but current materials describe FCHIP as still being built for pilot. Do not claim MVP stage, paying FCHIP customers, or AI performance without evidence.</w:t>
+        <w:t>The portal requires at least two founders and a minimum viable product. FCHIP MVP status is confirmed. Do not invent paying FCHIP customers, AI performance scores, or unsigned partners. Complete founder and commercial CONFIRM fields before submission.</w:t>
       </w:r>
     </w:p>
     <w:p>
@@ -494,7 +494,7 @@
           <w:color w:val="1E2F38"/>
           <w:sz w:val="20"/>
         </w:rPr>
-        <w:t>Confirm a working FCHIP MVP with a demo or evidence. Repo materials currently describe FCHIP as still being built/piloted, so do not select MVP unless that is no longer true.</w:t>
+        <w:t>FCHIP MVP is confirmed - keep a short demo or screenshots ready for screening calls.</w:t>
       </w:r>
     </w:p>
     <w:p>
@@ -542,7 +542,7 @@
           <w:color w:val="1E2F38"/>
           <w:sz w:val="20"/>
         </w:rPr>
-        <w:t>Upload the pitch deck to a public-access link and test it while signed out.</w:t>
+        <w:t>Upload the pitch deck (PPT + PDF) to Google Drive with public access; test the link while signed out.</w:t>
       </w:r>
     </w:p>
     <w:tbl>
@@ -741,7 +741,7 @@
                 <w:color w:val="1E2F38"/>
                 <w:sz w:val="18"/>
               </w:rPr>
-              <w:t>Working FCHIP MVP evidence</w:t>
+              <w:t>Working FCHIP MVP</w:t>
             </w:r>
           </w:p>
         </w:tc>
@@ -755,7 +755,6 @@
               <w:end w:w="120" w:type="dxa"/>
             </w:tcMar>
             <w:shd w:fill="E8F3F2"/>
-            <w:shd w:fill="FBEDE6"/>
             <w:vAlign w:val="top"/>
           </w:tcPr>
           <w:p>
@@ -765,10 +764,10 @@
                 <w:rFonts w:ascii="Aptos" w:hAnsi="Aptos"/>
                 <w:b w:val="0"/>
                 <w:i w:val="0"/>
-                <w:color w:val="A3312D"/>
+                <w:color w:val="1E2F38"/>
                 <w:sz w:val="18"/>
               </w:rPr>
-              <w:t>CONFIRM BEFORE SUBMISSION - currently pre-MVP in repo</w:t>
+              <w:t>Confirmed - keep demo/screenshots ready</w:t>
             </w:r>
           </w:p>
         </w:tc>
@@ -903,7 +902,7 @@
                 <w:color w:val="1E2F38"/>
                 <w:sz w:val="18"/>
               </w:rPr>
-              <w:t>Website and public pitch-deck link</w:t>
+              <w:t>Website</w:t>
             </w:r>
           </w:p>
         </w:tc>
@@ -930,6 +929,60 @@
                 <w:sz w:val="18"/>
               </w:rPr>
               <w:t>CONFIRM BEFORE SUBMISSION</w:t>
+            </w:r>
+          </w:p>
+        </w:tc>
+      </w:tr>
+      <w:tr>
+        <w:tc>
+          <w:tcPr>
+            <w:tcW w:type="dxa" w:w="3744"/>
+            <w:tcMar>
+              <w:top w:w="100" w:type="dxa"/>
+              <w:start w:w="120" w:type="dxa"/>
+              <w:bottom w:w="100" w:type="dxa"/>
+              <w:end w:w="120" w:type="dxa"/>
+            </w:tcMar>
+            <w:shd w:fill="E8F3F2"/>
+            <w:vAlign w:val="top"/>
+          </w:tcPr>
+          <w:p>
+            <w:r/>
+            <w:r>
+              <w:rPr>
+                <w:rFonts w:ascii="Aptos" w:hAnsi="Aptos"/>
+                <w:b/>
+                <w:i w:val="0"/>
+                <w:color w:val="1E2F38"/>
+                <w:sz w:val="18"/>
+              </w:rPr>
+              <w:t>Public pitch-deck Drive link</w:t>
+            </w:r>
+          </w:p>
+        </w:tc>
+        <w:tc>
+          <w:tcPr>
+            <w:tcW w:type="dxa" w:w="5760"/>
+            <w:tcMar>
+              <w:top w:w="100" w:type="dxa"/>
+              <w:start w:w="120" w:type="dxa"/>
+              <w:bottom w:w="100" w:type="dxa"/>
+              <w:end w:w="120" w:type="dxa"/>
+            </w:tcMar>
+            <w:shd w:fill="E8F3F2"/>
+            <w:vAlign w:val="top"/>
+          </w:tcPr>
+          <w:p>
+            <w:r/>
+            <w:r>
+              <w:rPr>
+                <w:rFonts w:ascii="Aptos" w:hAnsi="Aptos"/>
+                <w:b w:val="0"/>
+                <w:i w:val="0"/>
+                <w:color w:val="1E2F38"/>
+                <w:sz w:val="18"/>
+              </w:rPr>
+              <w:t>CONFIRM AFTER UPLOAD (PPT + PDF)</w:t>
             </w:r>
           </w:p>
         </w:tc>
@@ -2235,7 +2288,6 @@
               <w:bottom w:w="70" w:type="dxa"/>
               <w:end w:w="120" w:type="dxa"/>
             </w:tcMar>
-            <w:shd w:fill="FBEDE6"/>
             <w:vAlign w:val="top"/>
           </w:tcPr>
           <w:p>
@@ -2245,10 +2297,10 @@
                 <w:rFonts w:ascii="Aptos" w:hAnsi="Aptos"/>
                 <w:b w:val="0"/>
                 <w:i w:val="0"/>
-                <w:color w:val="A3312D"/>
+                <w:color w:val="1E2F38"/>
                 <w:sz w:val="17"/>
               </w:rPr>
-              <w:t>[CONFIRM BEFORE SUBMISSION. Repo evidence points to pre-MVP / pilot preparation. Select MVP only if a working product can be demonstrated - the programme requires an MVP.]</w:t>
+              <w:t>MVP - working FCHIP product ready for structured validation in FairBanks Community Reach (applicant-confirmed).</w:t>
             </w:r>
           </w:p>
         </w:tc>
@@ -2540,7 +2592,7 @@
                 <w:color w:val="1E2F38"/>
                 <w:sz w:val="17"/>
               </w:rPr>
-              <w:t>FCHIP is an offline-capable community health intelligence platform. CHWs and VHTs capture structured household and outreach data through mobile tools; approved facility and programme data are synchronized securely; and FCHIP safely exposes authenticated data APIs to existing EMR and HMS systems so clinics can share clinical records into the platform in real time without replacing the software they already use. An analytics layer produces risk flags, GIS hotspot maps, referrals, and dashboards. The first release focuses on three practical use cases: maternal risk and missed-care alerts, hypertension and diabetes hotspot detection, and community disease surveillance. FairBanks will validate the product in its existing medical centre and Community Reach network before expanding to partner clinics and districts.</w:t>
+              <w:t>FCHIP is an offline-capable community health intelligence platform with a working MVP. CHWs and VHTs capture structured household and outreach data through mobile tools; approved facility and programme data are synchronized securely; and FCHIP safely exposes authenticated data APIs to existing EMR and HMS systems so clinics can share clinical records into the platform in real time without replacing the software they already use. An analytics layer produces risk flags, GIS hotspot maps, referrals, and dashboards. The first release focuses on three practical use cases: maternal risk and missed-care alerts, hypertension and diabetes hotspot detection, and community disease surveillance. FairBanks is validating the MVP in its existing medical centre and Community Reach network before expanding to partner clinics and districts.</w:t>
             </w:r>
           </w:p>
         </w:tc>
@@ -2752,7 +2804,7 @@
                 <w:color w:val="1E2F38"/>
                 <w:sz w:val="17"/>
               </w:rPr>
-              <w:t>FairBanks combines what many health-tech startups and facilities lack: a live medical centre, active outreach programmes, CHW and VHT links, digital health workflows, and a product designed from real community care. This gives FCHIP a direct test environment and a trusted route to users. Secure EMR/HMS data APIs let facilities plug clinical feeds into FCHIP without ripping out existing systems. The platform is not only an electronic register; it closes the loop from community and facility signal to risk insight, referral, targeted outreach, and follow-up.</w:t>
+              <w:t>FairBanks combines what many health-tech startups and facilities lack: a live medical centre, active outreach programmes, CHW and VHT links, digital health workflows, and a working FCHIP MVP designed from real community care. This gives the product a direct test environment and a trusted route to users. Secure EMR/HMS data APIs let facilities plug clinical feeds into FCHIP without ripping out existing systems. The platform is not only an electronic register; it closes the loop from community and facility signal to risk insight, referral, targeted outreach, and follow-up.</w:t>
             </w:r>
           </w:p>
         </w:tc>
@@ -2846,7 +2898,6 @@
               <w:bottom w:w="70" w:type="dxa"/>
               <w:end w:w="120" w:type="dxa"/>
             </w:tcMar>
-            <w:shd w:fill="FBEDE6"/>
             <w:vAlign w:val="top"/>
           </w:tcPr>
           <w:p>
@@ -2856,10 +2907,10 @@
                 <w:rFonts w:ascii="Aptos" w:hAnsi="Aptos"/>
                 <w:b w:val="0"/>
                 <w:i w:val="0"/>
-                <w:color w:val="A3312D"/>
+                <w:color w:val="1E2F38"/>
                 <w:sz w:val="17"/>
               </w:rPr>
-              <w:t>[CONFIRM BEFORE SUBMISSION: upload the generated PPT/PDF to Google Drive or another public link; test access while signed out]</w:t>
+              <w:t>[CONFIRM AFTER UPLOAD] Upload the generated PPT and pitch PDF to Google Drive (G:\My Drive\Application Docs\FairBanks\Africa Health-Tech Accelerator 2026), enable Anyone-with-the-link access, test while signed out, then paste the share URL here.</w:t>
             </w:r>
           </w:p>
         </w:tc>
@@ -3719,7 +3770,7 @@
                 <w:color w:val="1E2F38"/>
                 <w:sz w:val="17"/>
               </w:rPr>
-              <w:t>Recommended if MVP is verified: Validate product-market fit. Otherwise FairBanks is not yet eligible under the stated MVP rule.</w:t>
+              <w:t>Validate product-market fit for the working FCHIP MVP with CHWs, facility teams, and partner pathways.</w:t>
             </w:r>
           </w:p>
         </w:tc>
@@ -3853,7 +3904,7 @@
                 <w:color w:val="1E2F38"/>
                 <w:sz w:val="17"/>
               </w:rPr>
-              <w:t>1. Validation &amp; Market Research; 2. Product Development (MVP, UX, iteration); 3. Partnerships &amp; Ecosystem Access.</w:t>
+              <w:t>1. Validation &amp; Market Research; 2. Product Development (UX iteration on the MVP); 3. Partnerships &amp; Ecosystem Access.</w:t>
             </w:r>
           </w:p>
         </w:tc>
@@ -4039,7 +4090,7 @@
                 <w:color w:val="1E2F38"/>
                 <w:sz w:val="17"/>
               </w:rPr>
-              <w:t>Our biggest bottleneck is converting a strong real-world health delivery foundation into a validated, investment-ready product. We need disciplined MVP validation, user testing with CHWs and facility teams, a clear product-market fit case, and partnerships that can support deployment beyond one FairBanks catchment. We also need to strengthen our evidence, data-governance, and fundraising package without overbuilding before the highest-value workflows are proven.</w:t>
+              <w:t>Our biggest bottleneck is converting a working MVP and a strong real-world health delivery foundation into validated, investment-ready traction. We need disciplined product-market fit evidence with CHWs and facility teams, clearer buying pathways beyond one FairBanks catchment, and partnerships that support deployment at district and programme scale. We also need to strengthen our evidence, data-governance, and fundraising package without overbuilding before the highest-value workflows are proven.</w:t>
             </w:r>
           </w:p>
         </w:tc>
@@ -4091,7 +4142,7 @@
                 <w:color w:val="1E2F38"/>
                 <w:sz w:val="17"/>
               </w:rPr>
-              <w:t>The accelerator directly matches FCHIP's next milestone: validate an Africa-built digital health platform and prepare it for cross-border scale. Mentorship can sharpen our product choices and business model; healthcare and public-sector networks can open credible pilot and integration pathways; and investor-readiness support can turn field evidence into a financeable growth plan. We will contribute a practical Ugandan perspective grounded in community outreach, primary care, CHW and VHT workflows, and the daily realities of underserved urban communities.</w:t>
+              <w:t>The accelerator directly matches FCHIP's next milestone: validate an Africa-built digital health MVP and prepare it for cross-border scale. Mentorship can sharpen our product choices and business model; healthcare and public-sector networks can open credible pilot and integration pathways; and investor-readiness support can turn field evidence into a financeable growth plan. We will contribute a practical Ugandan perspective grounded in community outreach, primary care, CHW and VHT workflows, and the daily realities of underserved urban communities.</w:t>
             </w:r>
           </w:p>
         </w:tc>
@@ -4270,7 +4321,7 @@
           <w:color w:val="1E2F38"/>
           <w:sz w:val="20"/>
         </w:rPr>
-        <w:t>FCHIP is an offline-capable community health intelligence platform. CHWs and VHTs capture structured household and outreach data through mobile tools; approved facility and programme data are synchronized securely; and FCHIP safely exposes authenticated data APIs to existing EMR and HMS systems so clinics can share clinical records into the platform in real time without replacing the software they already use. An analytics layer produces risk flags, GIS hotspot maps, referrals, and dashboards. The first release focuses on three practical use cases: maternal risk and missed-care alerts, hypertension and diabetes hotspot detection, and community disease surveillance. FairBanks will validate the product in its existing medical centre and Community Reach network before expanding to partner clinics and districts.</w:t>
+        <w:t>FCHIP is an offline-capable community health intelligence platform with a working MVP. CHWs and VHTs capture structured household and outreach data through mobile tools; approved facility and programme data are synchronized securely; and FCHIP safely exposes authenticated data APIs to existing EMR and HMS systems so clinics can share clinical records into the platform in real time without replacing the software they already use. An analytics layer produces risk flags, GIS hotspot maps, referrals, and dashboards. The first release focuses on three practical use cases: maternal risk and missed-care alerts, hypertension and diabetes hotspot detection, and community disease surveillance. FairBanks is validating the MVP in its existing medical centre and Community Reach network before expanding to partner clinics and districts.</w:t>
       </w:r>
     </w:p>
     <w:p>
@@ -4294,7 +4345,7 @@
           <w:color w:val="1E2F38"/>
           <w:sz w:val="20"/>
         </w:rPr>
-        <w:t>FairBanks combines what many health-tech startups and facilities lack: a live medical centre, active outreach programmes, CHW and VHT links, digital health workflows, and a product designed from real community care. This gives FCHIP a direct test environment and a trusted route to users. Secure EMR/HMS data APIs let facilities plug clinical feeds into FCHIP without ripping out existing systems. The platform is not only an electronic register; it closes the loop from community and facility signal to risk insight, referral, targeted outreach, and follow-up.</w:t>
+        <w:t>FairBanks combines what many health-tech startups and facilities lack: a live medical centre, active outreach programmes, CHW and VHT links, digital health workflows, and a working FCHIP MVP designed from real community care. This gives the product a direct test environment and a trusted route to users. Secure EMR/HMS data APIs let facilities plug clinical feeds into FCHIP without ripping out existing systems. The platform is not only an electronic register; it closes the loop from community and facility signal to risk insight, referral, targeted outreach, and follow-up.</w:t>
       </w:r>
     </w:p>
     <w:p>
@@ -5411,7 +5462,7 @@
           <w:color w:val="1E2F38"/>
           <w:sz w:val="20"/>
         </w:rPr>
-        <w:t>Digital health records and pharmacy workflows that can inform product integration.</w:t>
+        <w:t>Digital health records and pharmacy workflows that inform product integration.</w:t>
       </w:r>
     </w:p>
     <w:p>
@@ -5427,7 +5478,7 @@
           <w:color w:val="1E2F38"/>
           <w:sz w:val="20"/>
         </w:rPr>
-        <w:t>Planned secure EMR/HMS data APIs so existing facility systems can feed clinical data into FCHIP in real time without replacement.</w:t>
+        <w:t>Secure EMR/HMS data APIs so existing facility systems can feed clinical data into FCHIP in real time without replacement.</w:t>
       </w:r>
     </w:p>
     <w:p>
@@ -5443,7 +5494,7 @@
           <w:color w:val="1E2F38"/>
           <w:sz w:val="20"/>
         </w:rPr>
-        <w:t>FCHIP itself remains a planned / pre-MVP build in current repository materials unless newer product evidence is supplied.</w:t>
+        <w:t>Working FCHIP MVP (applicant-confirmed) ready for structured validation inside the live FairBanks cascade.</w:t>
       </w:r>
     </w:p>
     <w:p>
@@ -5599,7 +5650,7 @@
                 <w:color w:val="1E2F38"/>
                 <w:sz w:val="18"/>
               </w:rPr>
-              <w:t>Confirm users, workflows, MVP evidence, governance, and baseline indicators.</w:t>
+              <w:t>Lock users, workflows, governance, demo evidence, and baseline indicators.</w:t>
             </w:r>
           </w:p>
         </w:tc>
@@ -6163,7 +6214,7 @@
           <w:color w:val="1E2F38"/>
           <w:sz w:val="20"/>
         </w:rPr>
-        <w:t>The accelerator directly matches FCHIP's next milestone: validate an Africa-built digital health platform and prepare it for cross-border scale. Mentorship can sharpen our product choices and business model; healthcare and public-sector networks can open credible pilot and integration pathways; and investor-readiness support can turn field evidence into a financeable growth plan. We will contribute a practical Ugandan perspective grounded in community outreach, primary care, CHW and VHT workflows, and the daily realities of underserved urban communities.</w:t>
+        <w:t>The accelerator directly matches FCHIP's next milestone: validate an Africa-built digital health MVP and prepare it for cross-border scale. Mentorship can sharpen our product choices and business model; healthcare and public-sector networks can open credible pilot and integration pathways; and investor-readiness support can turn field evidence into a financeable growth plan. We will contribute a practical Ugandan perspective grounded in community outreach, primary care, CHW and VHT workflows, and the daily realities of underserved urban communities.</w:t>
       </w:r>
     </w:p>
     <w:p>
@@ -6289,7 +6340,7 @@
                 <w:color w:val="1E2F38"/>
                 <w:sz w:val="17"/>
               </w:rPr>
-              <w:t>Confirm two founders and demonstrable MVP before submission.</w:t>
+              <w:t>Confirm two founders before submission; MVP is already confirmed.</w:t>
             </w:r>
           </w:p>
         </w:tc>
@@ -6704,7 +6755,7 @@
           <w:color w:val="1E2F38"/>
           <w:sz w:val="20"/>
         </w:rPr>
-        <w:t>[  ]  Attach evidence of a working FCHIP MVP.</w:t>
+        <w:t>[  ]  Select Startup Stage = MVP; keep a short demo or screenshots ready.</w:t>
       </w:r>
     </w:p>
     <w:p>
@@ -6779,7 +6830,22 @@
           <w:color w:val="1E2F38"/>
           <w:sz w:val="20"/>
         </w:rPr>
-        <w:t>[  ]  Upload the pitch deck; enable public link access; test while signed out.</w:t>
+        <w:t>[  ]  Upload PPT + pitch PDF to Google Drive; enable public link; test signed out.</w:t>
+      </w:r>
+    </w:p>
+    <w:p>
+      <w:pPr>
+        <w:spacing w:after="80"/>
+      </w:pPr>
+      <w:r>
+        <w:rPr>
+          <w:rFonts w:ascii="Aptos" w:hAnsi="Aptos"/>
+          <w:b w:val="0"/>
+          <w:i w:val="0"/>
+          <w:color w:val="1E2F38"/>
+          <w:sz w:val="20"/>
+        </w:rPr>
+        <w:t>[  ]  Paste the Drive share URL into Pitch Deck (upload link).</w:t>
       </w:r>
     </w:p>
     <w:p>
@@ -7116,7 +7182,7 @@
           <w:color w:val="52636C"/>
           <w:sz w:val="18"/>
         </w:rPr>
-        <w:t>Source check date: 19 July 2026. The official portal wins if any detail changes.</w:t>
+        <w:t>Source check date: 20 July 2026. The official portal wins if any detail changes.</w:t>
       </w:r>
     </w:p>
     <w:sectPr>

</xml_diff>